<commit_message>
Actualiza informe con capturas, sitio web y scripts de infraestructura
</commit_message>
<xml_diff>
--- a/documentacion/Informe_Laboratorio_2_Velasquez_Delgado.docx
+++ b/documentacion/Informe_Laboratorio_2_Velasquez_Delgado.docx
@@ -111,12 +111,12 @@
         <w:pStyle w:val="Heading2"/>
       </w:pPr>
       <w:r>
-        <w:t>1. Identidad del Emprendimiento: Murano Voley Connect</w:t>
+        <w:t>1. Descripción del Proyecto</w:t>
       </w:r>
     </w:p>
     <w:p>
       <w:r>
-        <w:t>Murano Voley Connect es la evolución digital de la academia Murano Puerto Montt. Tras el éxito del sitio estático inicial, se ha identificado la necesidad de migrar hacia una infraestructura escalable capaz de manejar la alta demanda de usuarios durante las temporadas de torneos regionales en el sur de Chile. Nuestra plataforma conecta a la comunidad deportiva mediante un entorno resiliente y de alta disponibilidad.</w:t>
+        <w:t>Murano Voley es una academia deportiva de voleibol ubicada en Puerto Montt, Chile. Para este laboratorio se tomó esta organización como caso base y se desarrolló un sitio web estático servido mediante contenedores Docker, desplegado sobre Amazon ECS con Fargate como tipo de lanzamiento.</w:t>
       </w:r>
     </w:p>
     <w:p>
@@ -129,18 +129,18 @@
     </w:p>
     <w:p>
       <w:r>
-        <w:t>La solución se basa en una arquitectura de microservicios serverless utilizando el orquestador Amazon ECS. Los componentes clave son:</w:t>
+        <w:t>La arquitectura desplegada en AWS consiste en los siguientes componentes:</w:t>
       </w:r>
     </w:p>
     <w:p>
       <w:r>
-        <w:t>• Amazon ECR: Almacenamiento de imágenes Docker inmutables.</w:t>
+        <w:t>• Amazon ECR: Registro privado para almacenar la imagen Docker.</w:t>
         <w:br/>
-        <w:t>• AWS Fargate: Ejecución de contenedores sin gestión de servidores.</w:t>
+        <w:t>• AWS Fargate: Ejecución de contenedores sin gestión de instancias EC2.</w:t>
         <w:br/>
-        <w:t>• Application Load Balancer (ALB): Distribución inteligente de tráfico en múltiples AZ.</w:t>
+        <w:t>• Application Load Balancer (ALB): Distribución del tráfico HTTP en múltiples zonas de disponibilidad.</w:t>
         <w:br/>
-        <w:t>• VPC &amp; Redes: Reutilización de VPC existente con configuración Multi-AZ para tolerancia a fallos.</w:t>
+        <w:t>• VPC y Subredes: Red virtual con configuración Multi-AZ (us-east-1a y us-east-1b).</w:t>
       </w:r>
     </w:p>
     <w:p>
@@ -175,7 +175,7 @@
     </w:p>
     <w:p>
       <w:r>
-        <w:t>Se construyó una imagen optimizada utilizando Nginx sobre Alpine Linux:</w:t>
+        <w:t>Se construyó la imagen sobre Nginx Alpine, una base oficial de tamaño reducido:</w:t>
       </w:r>
     </w:p>
     <w:p>
@@ -205,7 +205,7 @@
     </w:p>
     <w:p>
       <w:r>
-        <w:t>Se configuró la tarea bajo el modo de red 'awsvpc', asignando recursos mínimos para eficiencia de costos:</w:t>
+        <w:t>La tarea se configuró con modo de red awsvpc y recursos mínimos válidos para Fargate (256 vCPU / 512 MB):</w:t>
       </w:r>
     </w:p>
     <w:p>
@@ -230,7 +230,7 @@
         <w:br/>
         <w:t xml:space="preserve">    "name": "murano-web",</w:t>
         <w:br/>
-        <w:t xml:space="preserve">    "image": "[ACCOUNT_ID].dkr.ecr.us-east-1.amazonaws.com/murano-voley-connect:1.0",</w:t>
+        <w:t xml:space="preserve">    "image": "[ACCOUNT_ID].dkr.ecr.us-east-1.amazonaws.com/murano-voley:1.0",</w:t>
         <w:br/>
         <w:t xml:space="preserve">    "portMappings": [{ "containerPort": 80 }]</w:t>
         <w:br/>
@@ -249,7 +249,7 @@
     </w:p>
     <w:p>
       <w:r>
-        <w:t>Una de las ventajas críticas de esta implementación es la capacidad de escalado declarativo. Mediante AWS CLI, se aumentó la capacidad de la plataforma de 2 a 4 tareas en tiempo real:</w:t>
+        <w:t>El servicio se desplegó inicialmente con desired-count 2 y luego se escaló a 4 tareas mediante el siguiente comando de AWS CLI:</w:t>
       </w:r>
     </w:p>
     <w:p>
@@ -267,7 +267,7 @@
     </w:p>
     <w:p>
       <w:r>
-        <w:t>Este proceso es gestionado automáticamente por el orquestador, registrando las nuevas IP en el balanceador.</w:t>
+        <w:t>El orquestador registra automáticamente las nuevas IPs en el Target Group del balanceador.</w:t>
       </w:r>
     </w:p>
     <w:p>
@@ -335,7 +335,10 @@
     </w:p>
     <w:p>
       <w:r>
-        <w:t>La migración a ECS Fargate representa una mejora significativa en la resiliencia de Murano Voley Connect. En términos de costos, el uso de Fargate permite un ahorro sustancial al no requerir instancias EC2 encendidas 24/7, pagando únicamente por los recursos consumidos durante la ejecución de las tareas. Se ha verificado la limpieza de recursos post-implementación para mantener el presupuesto dentro del Free Tier.</w:t>
+        <w:t>El laboratorio permitió implementar un flujo completo de contenerización y orquestación: construcción de imagen Docker, publicación en ECR, definición de tarea ECS y despliegue en Fargate con balanceador de carga Multi-AZ.</w:t>
+        <w:br/>
+        <w:br/>
+        <w:t>En cuanto a costos, Fargate cobra por tiempo de ejecución (vCPU y memoria por segundo), lo que resulta adecuado para cargas puntuales. Una vez finalizada la evaluación se eliminaron todos los recursos para evitar costos adicionales.</w:t>
       </w:r>
     </w:p>
     <w:p>

</xml_diff>